<commit_message>
document updated with all the steps and screenshots
</commit_message>
<xml_diff>
--- a/Linux_Assginment_Apoorva_Deshpande.docx
+++ b/Linux_Assginment_Apoorva_Deshpande.docx
@@ -18,6 +18,42 @@
           <w:sz w:val="32"/>
           <w:szCs w:val="32"/>
         </w:rPr>
+        <w:t>Git Link for the Linux assignment:</w:t>
+      </w:r>
+    </w:p>
+    <w:p>
+      <w:pPr>
+        <w:rPr>
+          <w:sz w:val="32"/>
+          <w:szCs w:val="32"/>
+          <w:u w:val="single"/>
+        </w:rPr>
+      </w:pPr>
+      <w:r>
+        <w:rPr>
+          <w:sz w:val="32"/>
+          <w:szCs w:val="32"/>
+          <w:u w:val="single"/>
+        </w:rPr>
+        <w:t>https://github.com/ApoorvaD90/Apoorva_HV_Linux_Practice_Assignment</w:t>
+      </w:r>
+    </w:p>
+    <w:p>
+      <w:pPr>
+        <w:rPr>
+          <w:b/>
+          <w:bCs/>
+          <w:sz w:val="32"/>
+          <w:szCs w:val="32"/>
+        </w:rPr>
+      </w:pPr>
+      <w:r>
+        <w:rPr>
+          <w:b/>
+          <w:bCs/>
+          <w:sz w:val="32"/>
+          <w:szCs w:val="32"/>
+        </w:rPr>
         <w:t>Task 1:</w:t>
       </w:r>
     </w:p>
@@ -58,6 +94,62 @@
           <w:szCs w:val="32"/>
         </w:rPr>
         <w:t>:</w:t>
+      </w:r>
+    </w:p>
+    <w:p>
+      <w:pPr>
+        <w:rPr>
+          <w:sz w:val="32"/>
+          <w:szCs w:val="32"/>
+        </w:rPr>
+      </w:pPr>
+      <w:proofErr w:type="spellStart"/>
+      <w:r>
+        <w:rPr>
+          <w:sz w:val="32"/>
+          <w:szCs w:val="32"/>
+        </w:rPr>
+        <w:t>Htop</w:t>
+      </w:r>
+      <w:proofErr w:type="spellEnd"/>
+      <w:r>
+        <w:rPr>
+          <w:sz w:val="32"/>
+          <w:szCs w:val="32"/>
+        </w:rPr>
+        <w:t xml:space="preserve"> is installed using ‘</w:t>
+      </w:r>
+      <w:proofErr w:type="spellStart"/>
+      <w:r>
+        <w:rPr>
+          <w:sz w:val="32"/>
+          <w:szCs w:val="32"/>
+        </w:rPr>
+        <w:t>sudo</w:t>
+      </w:r>
+      <w:proofErr w:type="spellEnd"/>
+      <w:r>
+        <w:rPr>
+          <w:sz w:val="32"/>
+          <w:szCs w:val="32"/>
+        </w:rPr>
+        <w:t xml:space="preserve"> apt install </w:t>
+      </w:r>
+      <w:proofErr w:type="spellStart"/>
+      <w:r>
+        <w:rPr>
+          <w:sz w:val="32"/>
+          <w:szCs w:val="32"/>
+        </w:rPr>
+        <w:t>htop</w:t>
+      </w:r>
+      <w:proofErr w:type="spellEnd"/>
+      <w:r>
+        <w:rPr>
+          <w:sz w:val="32"/>
+          <w:szCs w:val="32"/>
+        </w:rPr>
+        <w:t>’ command</w:t>
       </w:r>
     </w:p>
     <w:p>
@@ -112,6 +204,66 @@
           <w:szCs w:val="32"/>
         </w:rPr>
       </w:pPr>
+    </w:p>
+    <w:p>
+      <w:pPr>
+        <w:rPr>
+          <w:b/>
+          <w:bCs/>
+          <w:sz w:val="32"/>
+          <w:szCs w:val="32"/>
+        </w:rPr>
+      </w:pPr>
+    </w:p>
+    <w:p>
+      <w:pPr>
+        <w:rPr>
+          <w:b/>
+          <w:bCs/>
+          <w:sz w:val="32"/>
+          <w:szCs w:val="32"/>
+        </w:rPr>
+      </w:pPr>
+    </w:p>
+    <w:p>
+      <w:pPr>
+        <w:rPr>
+          <w:b/>
+          <w:bCs/>
+          <w:sz w:val="32"/>
+          <w:szCs w:val="32"/>
+        </w:rPr>
+      </w:pPr>
+    </w:p>
+    <w:p>
+      <w:pPr>
+        <w:rPr>
+          <w:b/>
+          <w:bCs/>
+          <w:sz w:val="32"/>
+          <w:szCs w:val="32"/>
+        </w:rPr>
+      </w:pPr>
+    </w:p>
+    <w:p>
+      <w:pPr>
+        <w:rPr>
+          <w:b/>
+          <w:bCs/>
+          <w:sz w:val="32"/>
+          <w:szCs w:val="32"/>
+        </w:rPr>
+      </w:pPr>
+    </w:p>
+    <w:p>
+      <w:pPr>
+        <w:rPr>
+          <w:b/>
+          <w:bCs/>
+          <w:sz w:val="32"/>
+          <w:szCs w:val="32"/>
+        </w:rPr>
+      </w:pPr>
       <w:proofErr w:type="spellStart"/>
       <w:r>
         <w:rPr>
@@ -120,6 +272,7 @@
           <w:sz w:val="32"/>
           <w:szCs w:val="32"/>
         </w:rPr>
+        <w:lastRenderedPageBreak/>
         <w:t>Htop</w:t>
       </w:r>
       <w:proofErr w:type="spellEnd"/>
@@ -145,12 +298,33 @@
     <w:p>
       <w:pPr>
         <w:rPr>
-          <w:b/>
-          <w:bCs/>
-          <w:sz w:val="32"/>
-          <w:szCs w:val="32"/>
-        </w:rPr>
-      </w:pPr>
+          <w:sz w:val="32"/>
+          <w:szCs w:val="32"/>
+        </w:rPr>
+      </w:pPr>
+      <w:r>
+        <w:rPr>
+          <w:sz w:val="32"/>
+          <w:szCs w:val="32"/>
+        </w:rPr>
+        <w:t xml:space="preserve">Using </w:t>
+      </w:r>
+      <w:proofErr w:type="spellStart"/>
+      <w:r>
+        <w:rPr>
+          <w:sz w:val="32"/>
+          <w:szCs w:val="32"/>
+        </w:rPr>
+        <w:t>Htop</w:t>
+      </w:r>
+      <w:proofErr w:type="spellEnd"/>
+      <w:r>
+        <w:rPr>
+          <w:sz w:val="32"/>
+          <w:szCs w:val="32"/>
+        </w:rPr>
+        <w:t xml:space="preserve"> CPU, memory and processes are returned. The consumption on each process in regards to CPU and memory usage is logged in respective columns </w:t>
+      </w:r>
     </w:p>
     <w:p>
       <w:pPr>
@@ -212,7 +386,6 @@
         <w:rPr>
           <w:noProof/>
         </w:rPr>
-        <w:lastRenderedPageBreak/>
         <w:drawing>
           <wp:inline distT="0" distB="0" distL="0" distR="0" wp14:anchorId="37C6C9EC" wp14:editId="15407DA0">
             <wp:extent cx="5943600" cy="2728595"/>
@@ -279,19 +452,8 @@
           <w:sz w:val="32"/>
           <w:szCs w:val="32"/>
         </w:rPr>
-        <w:t xml:space="preserve"> </w:t>
-      </w:r>
-      <w:proofErr w:type="gramStart"/>
-      <w:r>
-        <w:rPr>
-          <w:b/>
-          <w:bCs/>
-          <w:sz w:val="32"/>
-          <w:szCs w:val="32"/>
-        </w:rPr>
-        <w:t>command :</w:t>
-      </w:r>
-      <w:proofErr w:type="gramEnd"/>
+        <w:t xml:space="preserve"> command :</w:t>
+      </w:r>
     </w:p>
     <w:p>
       <w:pPr>
@@ -310,6 +472,7 @@
           <w:sz w:val="32"/>
           <w:szCs w:val="32"/>
         </w:rPr>
+        <w:lastRenderedPageBreak/>
         <w:drawing>
           <wp:inline distT="0" distB="0" distL="0" distR="0" wp14:anchorId="567E791B" wp14:editId="3C2070D3">
             <wp:extent cx="5943600" cy="1657350"/>
@@ -423,7 +586,6 @@
         <w:rPr>
           <w:noProof/>
         </w:rPr>
-        <w:lastRenderedPageBreak/>
         <w:drawing>
           <wp:inline distT="0" distB="0" distL="0" distR="0" wp14:anchorId="662E0C3F" wp14:editId="70DF8228">
             <wp:extent cx="5943600" cy="3779520"/>
@@ -466,6 +628,7 @@
         <w:rPr>
           <w:noProof/>
         </w:rPr>
+        <w:lastRenderedPageBreak/>
         <w:drawing>
           <wp:inline distT="0" distB="0" distL="0" distR="0" wp14:anchorId="373B5CC6" wp14:editId="10D74530">
             <wp:extent cx="5943600" cy="4177665"/>
@@ -588,6 +751,7 @@
           <w:sz w:val="32"/>
           <w:szCs w:val="32"/>
         </w:rPr>
+        <w:lastRenderedPageBreak/>
         <w:drawing>
           <wp:inline distT="0" distB="0" distL="0" distR="0" wp14:anchorId="182A8B8A" wp14:editId="7A434FA4">
             <wp:extent cx="5943600" cy="2949575"/>
@@ -725,7 +889,6 @@
           <w:sz w:val="32"/>
           <w:szCs w:val="32"/>
         </w:rPr>
-        <w:lastRenderedPageBreak/>
         <w:drawing>
           <wp:inline distT="0" distB="0" distL="0" distR="0" wp14:anchorId="7A2D496C" wp14:editId="7F62BBD2">
             <wp:extent cx="5943600" cy="2726055"/>
@@ -780,6 +943,7 @@
           <w:sz w:val="32"/>
           <w:szCs w:val="32"/>
         </w:rPr>
+        <w:lastRenderedPageBreak/>
         <w:drawing>
           <wp:inline distT="0" distB="0" distL="0" distR="0" wp14:anchorId="65C7A7CE" wp14:editId="408E0EC1">
             <wp:extent cx="5943600" cy="874395"/>
@@ -833,7 +997,36 @@
           <w:sz w:val="32"/>
           <w:szCs w:val="32"/>
         </w:rPr>
-        <w:t>Permission provided for mike:</w:t>
+        <w:t xml:space="preserve">Permission provided for </w:t>
+      </w:r>
+      <w:proofErr w:type="spellStart"/>
+      <w:r>
+        <w:rPr>
+          <w:b/>
+          <w:bCs/>
+          <w:sz w:val="32"/>
+          <w:szCs w:val="32"/>
+        </w:rPr>
+        <w:t>sarah</w:t>
+      </w:r>
+      <w:proofErr w:type="spellEnd"/>
+      <w:r>
+        <w:rPr>
+          <w:b/>
+          <w:bCs/>
+          <w:sz w:val="32"/>
+          <w:szCs w:val="32"/>
+        </w:rPr>
+        <w:t xml:space="preserve"> and </w:t>
+      </w:r>
+      <w:r>
+        <w:rPr>
+          <w:b/>
+          <w:bCs/>
+          <w:sz w:val="32"/>
+          <w:szCs w:val="32"/>
+        </w:rPr>
+        <w:t>mike:</w:t>
       </w:r>
     </w:p>
     <w:p>
@@ -991,44 +1184,34 @@
           <w:szCs w:val="32"/>
         </w:rPr>
       </w:pPr>
-    </w:p>
-    <w:p>
-      <w:pPr>
-        <w:rPr>
-          <w:b/>
-          <w:bCs/>
-          <w:sz w:val="32"/>
-          <w:szCs w:val="32"/>
-        </w:rPr>
-      </w:pPr>
-      <w:r>
-        <w:rPr>
-          <w:b/>
-          <w:bCs/>
+      <w:r>
+        <w:rPr>
+          <w:b/>
+          <w:bCs/>
+          <w:sz w:val="32"/>
+          <w:szCs w:val="32"/>
+        </w:rPr>
+        <w:t>Install Apache for Sarah</w:t>
+      </w:r>
+    </w:p>
+    <w:p>
+      <w:pPr>
+        <w:rPr>
+          <w:b/>
+          <w:bCs/>
+          <w:sz w:val="32"/>
+          <w:szCs w:val="32"/>
+        </w:rPr>
+      </w:pPr>
+      <w:r>
+        <w:rPr>
+          <w:b/>
+          <w:bCs/>
+          <w:noProof/>
           <w:sz w:val="32"/>
           <w:szCs w:val="32"/>
         </w:rPr>
         <w:lastRenderedPageBreak/>
-        <w:t>Install Apache for Sarah</w:t>
-      </w:r>
-    </w:p>
-    <w:p>
-      <w:pPr>
-        <w:rPr>
-          <w:b/>
-          <w:bCs/>
-          <w:sz w:val="32"/>
-          <w:szCs w:val="32"/>
-        </w:rPr>
-      </w:pPr>
-      <w:r>
-        <w:rPr>
-          <w:b/>
-          <w:bCs/>
-          <w:noProof/>
-          <w:sz w:val="32"/>
-          <w:szCs w:val="32"/>
-        </w:rPr>
         <w:drawing>
           <wp:inline distT="0" distB="0" distL="0" distR="0" wp14:anchorId="6C7BEEFE" wp14:editId="09BF3CB2">
             <wp:extent cx="5943600" cy="4642485"/>
@@ -1083,7 +1266,6 @@
           <w:sz w:val="32"/>
           <w:szCs w:val="32"/>
         </w:rPr>
-        <w:lastRenderedPageBreak/>
         <w:drawing>
           <wp:inline distT="0" distB="0" distL="0" distR="0" wp14:anchorId="49712789" wp14:editId="42BF8E72">
             <wp:extent cx="5943600" cy="3110865"/>
@@ -1137,6 +1319,7 @@
           <w:sz w:val="32"/>
           <w:szCs w:val="32"/>
         </w:rPr>
+        <w:lastRenderedPageBreak/>
         <w:t>Allow firewall access:</w:t>
       </w:r>
     </w:p>
@@ -1203,16 +1386,6 @@
           <w:szCs w:val="32"/>
         </w:rPr>
       </w:pPr>
-    </w:p>
-    <w:p>
-      <w:pPr>
-        <w:rPr>
-          <w:b/>
-          <w:bCs/>
-          <w:sz w:val="32"/>
-          <w:szCs w:val="32"/>
-        </w:rPr>
-      </w:pPr>
       <w:r>
         <w:rPr>
           <w:b/>
@@ -1254,10 +1427,10 @@
         <w:rPr>
           <w:b/>
           <w:bCs/>
-          <w:sz w:val="32"/>
-          <w:szCs w:val="32"/>
-        </w:rPr>
-        <w:lastRenderedPageBreak/>
+          <w:noProof/>
+          <w:sz w:val="32"/>
+          <w:szCs w:val="32"/>
+        </w:rPr>
         <w:drawing>
           <wp:inline distT="0" distB="0" distL="0" distR="0" wp14:anchorId="3A0C8992" wp14:editId="1001342B">
             <wp:extent cx="5943600" cy="3842385"/>
@@ -1317,6 +1490,7 @@
         <w:rPr>
           <w:b/>
           <w:bCs/>
+          <w:noProof/>
           <w:sz w:val="32"/>
           <w:szCs w:val="32"/>
         </w:rPr>
@@ -1370,6 +1544,7 @@
         <w:rPr>
           <w:b/>
           <w:bCs/>
+          <w:noProof/>
           <w:sz w:val="32"/>
           <w:szCs w:val="32"/>
         </w:rPr>
@@ -1475,6 +1650,7 @@
         <w:rPr>
           <w:b/>
           <w:bCs/>
+          <w:noProof/>
         </w:rPr>
         <w:drawing>
           <wp:inline distT="0" distB="0" distL="0" distR="0" wp14:anchorId="27E95720" wp14:editId="2FDE3CCE">
@@ -1524,6 +1700,7 @@
         <w:rPr>
           <w:b/>
           <w:bCs/>
+          <w:noProof/>
         </w:rPr>
         <w:drawing>
           <wp:inline distT="0" distB="0" distL="0" distR="0" wp14:anchorId="4A4AD623" wp14:editId="062F1805">
@@ -1611,6 +1788,7 @@
         <w:rPr>
           <w:b/>
           <w:bCs/>
+          <w:noProof/>
           <w:sz w:val="32"/>
           <w:szCs w:val="32"/>
         </w:rPr>
@@ -1723,6 +1901,7 @@
         <w:rPr>
           <w:b/>
           <w:bCs/>
+          <w:noProof/>
           <w:sz w:val="32"/>
           <w:szCs w:val="32"/>
         </w:rPr>
@@ -1781,20 +1960,30 @@
         </w:rPr>
         <w:t>Create tar file of the nginx back</w:t>
       </w:r>
-    </w:p>
-    <w:p>
-      <w:pPr>
-        <w:rPr>
-          <w:b/>
-          <w:bCs/>
-          <w:sz w:val="32"/>
-          <w:szCs w:val="32"/>
-        </w:rPr>
-      </w:pPr>
-      <w:r>
-        <w:rPr>
-          <w:b/>
-          <w:bCs/>
+      <w:r>
+        <w:rPr>
+          <w:b/>
+          <w:bCs/>
+          <w:sz w:val="32"/>
+          <w:szCs w:val="32"/>
+        </w:rPr>
+        <w:t>up</w:t>
+      </w:r>
+    </w:p>
+    <w:p>
+      <w:pPr>
+        <w:rPr>
+          <w:b/>
+          <w:bCs/>
+          <w:sz w:val="32"/>
+          <w:szCs w:val="32"/>
+        </w:rPr>
+      </w:pPr>
+      <w:r>
+        <w:rPr>
+          <w:b/>
+          <w:bCs/>
+          <w:noProof/>
           <w:sz w:val="32"/>
           <w:szCs w:val="32"/>
         </w:rPr>
@@ -1888,6 +2077,7 @@
         <w:rPr>
           <w:b/>
           <w:bCs/>
+          <w:noProof/>
           <w:sz w:val="32"/>
           <w:szCs w:val="32"/>
         </w:rPr>
@@ -1944,42 +2134,23 @@
           <w:sz w:val="32"/>
           <w:szCs w:val="32"/>
         </w:rPr>
-        <w:t xml:space="preserve">Create compressed tar file of the </w:t>
-      </w:r>
-      <w:proofErr w:type="spellStart"/>
-      <w:r>
-        <w:rPr>
-          <w:b/>
-          <w:bCs/>
-          <w:sz w:val="32"/>
-          <w:szCs w:val="32"/>
-        </w:rPr>
-        <w:t>back up</w:t>
-      </w:r>
-      <w:proofErr w:type="spellEnd"/>
-      <w:r>
-        <w:rPr>
-          <w:b/>
-          <w:bCs/>
-          <w:sz w:val="32"/>
-          <w:szCs w:val="32"/>
-        </w:rPr>
-        <w:t xml:space="preserve"> file:</w:t>
-      </w:r>
-    </w:p>
-    <w:p>
-      <w:pPr>
-        <w:rPr>
-          <w:b/>
-          <w:bCs/>
-          <w:sz w:val="32"/>
-          <w:szCs w:val="32"/>
-        </w:rPr>
-      </w:pPr>
-      <w:r>
-        <w:rPr>
-          <w:b/>
-          <w:bCs/>
+        <w:t>Create compressed tar file of the backup file:</w:t>
+      </w:r>
+    </w:p>
+    <w:p>
+      <w:pPr>
+        <w:rPr>
+          <w:b/>
+          <w:bCs/>
+          <w:sz w:val="32"/>
+          <w:szCs w:val="32"/>
+        </w:rPr>
+      </w:pPr>
+      <w:r>
+        <w:rPr>
+          <w:b/>
+          <w:bCs/>
+          <w:noProof/>
           <w:sz w:val="32"/>
           <w:szCs w:val="32"/>
         </w:rPr>
@@ -2092,6 +2263,7 @@
         <w:rPr>
           <w:b/>
           <w:bCs/>
+          <w:noProof/>
           <w:sz w:val="32"/>
           <w:szCs w:val="32"/>
         </w:rPr>
@@ -2164,6 +2336,7 @@
         <w:rPr>
           <w:b/>
           <w:bCs/>
+          <w:noProof/>
           <w:sz w:val="32"/>
           <w:szCs w:val="32"/>
         </w:rPr>
@@ -2277,6 +2450,7 @@
         <w:rPr>
           <w:b/>
           <w:bCs/>
+          <w:noProof/>
           <w:sz w:val="32"/>
           <w:szCs w:val="32"/>
         </w:rPr>
@@ -2333,6 +2507,188 @@
           <w:sz w:val="32"/>
           <w:szCs w:val="32"/>
         </w:rPr>
+        <w:t>Apache b</w:t>
+      </w:r>
+      <w:r>
+        <w:rPr>
+          <w:b/>
+          <w:bCs/>
+          <w:sz w:val="32"/>
+          <w:szCs w:val="32"/>
+        </w:rPr>
+        <w:t>a</w:t>
+      </w:r>
+      <w:r>
+        <w:rPr>
+          <w:b/>
+          <w:bCs/>
+          <w:sz w:val="32"/>
+          <w:szCs w:val="32"/>
+        </w:rPr>
+        <w:t>ckup tar file validations</w:t>
+      </w:r>
+      <w:r>
+        <w:rPr>
+          <w:b/>
+          <w:bCs/>
+          <w:sz w:val="32"/>
+          <w:szCs w:val="32"/>
+        </w:rPr>
+        <w:t>(folders are present inside the tar):</w:t>
+      </w:r>
+    </w:p>
+    <w:p>
+      <w:pPr>
+        <w:rPr>
+          <w:b/>
+          <w:bCs/>
+          <w:sz w:val="32"/>
+          <w:szCs w:val="32"/>
+        </w:rPr>
+      </w:pPr>
+      <w:r>
+        <w:rPr>
+          <w:b/>
+          <w:bCs/>
+          <w:sz w:val="32"/>
+          <w:szCs w:val="32"/>
+        </w:rPr>
+        <w:drawing>
+          <wp:inline distT="0" distB="0" distL="0" distR="0" wp14:anchorId="0D540BB7" wp14:editId="30ACDA9A">
+            <wp:extent cx="5943600" cy="2939415"/>
+            <wp:effectExtent l="0" t="0" r="0" b="0"/>
+            <wp:docPr id="393821178" name="Picture 1"/>
+            <wp:cNvGraphicFramePr>
+              <a:graphicFrameLocks xmlns:a="http://schemas.openxmlformats.org/drawingml/2006/main" noChangeAspect="1"/>
+            </wp:cNvGraphicFramePr>
+            <a:graphic xmlns:a="http://schemas.openxmlformats.org/drawingml/2006/main">
+              <a:graphicData uri="http://schemas.openxmlformats.org/drawingml/2006/picture">
+                <pic:pic xmlns:pic="http://schemas.openxmlformats.org/drawingml/2006/picture">
+                  <pic:nvPicPr>
+                    <pic:cNvPr id="393821178" name=""/>
+                    <pic:cNvPicPr/>
+                  </pic:nvPicPr>
+                  <pic:blipFill>
+                    <a:blip r:embed="rId33"/>
+                    <a:stretch>
+                      <a:fillRect/>
+                    </a:stretch>
+                  </pic:blipFill>
+                  <pic:spPr>
+                    <a:xfrm>
+                      <a:off x="0" y="0"/>
+                      <a:ext cx="5943600" cy="2939415"/>
+                    </a:xfrm>
+                    <a:prstGeom prst="rect">
+                      <a:avLst/>
+                    </a:prstGeom>
+                  </pic:spPr>
+                </pic:pic>
+              </a:graphicData>
+            </a:graphic>
+          </wp:inline>
+        </w:drawing>
+      </w:r>
+    </w:p>
+    <w:p>
+      <w:pPr>
+        <w:rPr>
+          <w:b/>
+          <w:bCs/>
+          <w:sz w:val="32"/>
+          <w:szCs w:val="32"/>
+        </w:rPr>
+      </w:pPr>
+      <w:r>
+        <w:rPr>
+          <w:b/>
+          <w:bCs/>
+          <w:sz w:val="32"/>
+          <w:szCs w:val="32"/>
+        </w:rPr>
+        <w:lastRenderedPageBreak/>
+        <w:t>Index file backup:</w:t>
+      </w:r>
+    </w:p>
+    <w:p>
+      <w:pPr>
+        <w:rPr>
+          <w:b/>
+          <w:bCs/>
+          <w:sz w:val="32"/>
+          <w:szCs w:val="32"/>
+        </w:rPr>
+      </w:pPr>
+      <w:r>
+        <w:rPr>
+          <w:b/>
+          <w:bCs/>
+          <w:sz w:val="32"/>
+          <w:szCs w:val="32"/>
+        </w:rPr>
+        <w:drawing>
+          <wp:inline distT="0" distB="0" distL="0" distR="0" wp14:anchorId="0FE2398E" wp14:editId="4BC45F8B">
+            <wp:extent cx="5943600" cy="1417955"/>
+            <wp:effectExtent l="0" t="0" r="0" b="0"/>
+            <wp:docPr id="1250005614" name="Picture 1"/>
+            <wp:cNvGraphicFramePr>
+              <a:graphicFrameLocks xmlns:a="http://schemas.openxmlformats.org/drawingml/2006/main" noChangeAspect="1"/>
+            </wp:cNvGraphicFramePr>
+            <a:graphic xmlns:a="http://schemas.openxmlformats.org/drawingml/2006/main">
+              <a:graphicData uri="http://schemas.openxmlformats.org/drawingml/2006/picture">
+                <pic:pic xmlns:pic="http://schemas.openxmlformats.org/drawingml/2006/picture">
+                  <pic:nvPicPr>
+                    <pic:cNvPr id="1250005614" name=""/>
+                    <pic:cNvPicPr/>
+                  </pic:nvPicPr>
+                  <pic:blipFill>
+                    <a:blip r:embed="rId34"/>
+                    <a:stretch>
+                      <a:fillRect/>
+                    </a:stretch>
+                  </pic:blipFill>
+                  <pic:spPr>
+                    <a:xfrm>
+                      <a:off x="0" y="0"/>
+                      <a:ext cx="5943600" cy="1417955"/>
+                    </a:xfrm>
+                    <a:prstGeom prst="rect">
+                      <a:avLst/>
+                    </a:prstGeom>
+                  </pic:spPr>
+                </pic:pic>
+              </a:graphicData>
+            </a:graphic>
+          </wp:inline>
+        </w:drawing>
+      </w:r>
+    </w:p>
+    <w:p>
+      <w:pPr>
+        <w:rPr>
+          <w:b/>
+          <w:bCs/>
+          <w:sz w:val="32"/>
+          <w:szCs w:val="32"/>
+        </w:rPr>
+      </w:pPr>
+    </w:p>
+    <w:p>
+      <w:pPr>
+        <w:rPr>
+          <w:b/>
+          <w:bCs/>
+          <w:sz w:val="32"/>
+          <w:szCs w:val="32"/>
+        </w:rPr>
+      </w:pPr>
+      <w:r>
+        <w:rPr>
+          <w:b/>
+          <w:bCs/>
+          <w:sz w:val="32"/>
+          <w:szCs w:val="32"/>
+        </w:rPr>
         <w:t xml:space="preserve">Script to </w:t>
       </w:r>
       <w:proofErr w:type="spellStart"/>
@@ -2369,6 +2725,7 @@
         <w:rPr>
           <w:b/>
           <w:bCs/>
+          <w:noProof/>
           <w:sz w:val="32"/>
           <w:szCs w:val="32"/>
         </w:rPr>
@@ -2388,7 +2745,7 @@
                     <pic:cNvPicPr/>
                   </pic:nvPicPr>
                   <pic:blipFill>
-                    <a:blip r:embed="rId33"/>
+                    <a:blip r:embed="rId35"/>
                     <a:stretch>
                       <a:fillRect/>
                     </a:stretch>
@@ -2459,6 +2816,7 @@
         <w:rPr>
           <w:b/>
           <w:bCs/>
+          <w:noProof/>
           <w:sz w:val="32"/>
           <w:szCs w:val="32"/>
         </w:rPr>
@@ -2478,7 +2836,7 @@
                     <pic:cNvPicPr/>
                   </pic:nvPicPr>
                   <pic:blipFill>
-                    <a:blip r:embed="rId34"/>
+                    <a:blip r:embed="rId36"/>
                     <a:stretch>
                       <a:fillRect/>
                     </a:stretch>
@@ -2515,26 +2873,27 @@
           <w:sz w:val="32"/>
           <w:szCs w:val="32"/>
         </w:rPr>
+        <w:t>Cron job to run nginx server every Tuesday at 12:00 AM:</w:t>
+      </w:r>
+    </w:p>
+    <w:p>
+      <w:pPr>
+        <w:rPr>
+          <w:b/>
+          <w:bCs/>
+          <w:sz w:val="32"/>
+          <w:szCs w:val="32"/>
+        </w:rPr>
+      </w:pPr>
+      <w:r>
+        <w:rPr>
+          <w:b/>
+          <w:bCs/>
+          <w:noProof/>
+          <w:sz w:val="32"/>
+          <w:szCs w:val="32"/>
+        </w:rPr>
         <w:lastRenderedPageBreak/>
-        <w:t>Cron job to run nginx server every Tuesday at 12:00 AM:</w:t>
-      </w:r>
-    </w:p>
-    <w:p>
-      <w:pPr>
-        <w:rPr>
-          <w:b/>
-          <w:bCs/>
-          <w:sz w:val="32"/>
-          <w:szCs w:val="32"/>
-        </w:rPr>
-      </w:pPr>
-      <w:r>
-        <w:rPr>
-          <w:b/>
-          <w:bCs/>
-          <w:sz w:val="32"/>
-          <w:szCs w:val="32"/>
-        </w:rPr>
         <w:drawing>
           <wp:inline distT="0" distB="0" distL="0" distR="0" wp14:anchorId="5386D60A" wp14:editId="14D1B644">
             <wp:extent cx="5943600" cy="3257550"/>
@@ -2551,7 +2910,7 @@
                     <pic:cNvPicPr/>
                   </pic:nvPicPr>
                   <pic:blipFill>
-                    <a:blip r:embed="rId35"/>
+                    <a:blip r:embed="rId37"/>
                     <a:stretch>
                       <a:fillRect/>
                     </a:stretch>
@@ -2580,6 +2939,161 @@
         </w:rPr>
         <w:t xml:space="preserve"> </w:t>
       </w:r>
+    </w:p>
+    <w:p>
+      <w:pPr>
+        <w:rPr>
+          <w:b/>
+          <w:bCs/>
+          <w:sz w:val="32"/>
+          <w:szCs w:val="32"/>
+        </w:rPr>
+      </w:pPr>
+      <w:r>
+        <w:rPr>
+          <w:b/>
+          <w:bCs/>
+          <w:sz w:val="32"/>
+          <w:szCs w:val="32"/>
+        </w:rPr>
+        <w:t>Nginx backup tar file validation:</w:t>
+      </w:r>
+    </w:p>
+    <w:p>
+      <w:pPr>
+        <w:rPr>
+          <w:b/>
+          <w:bCs/>
+          <w:sz w:val="32"/>
+          <w:szCs w:val="32"/>
+        </w:rPr>
+      </w:pPr>
+      <w:r>
+        <w:rPr>
+          <w:b/>
+          <w:bCs/>
+          <w:sz w:val="32"/>
+          <w:szCs w:val="32"/>
+        </w:rPr>
+        <w:drawing>
+          <wp:inline distT="0" distB="0" distL="0" distR="0" wp14:anchorId="75583FDE" wp14:editId="792BB9BA">
+            <wp:extent cx="5943600" cy="3363595"/>
+            <wp:effectExtent l="0" t="0" r="0" b="8255"/>
+            <wp:docPr id="644525556" name="Picture 1"/>
+            <wp:cNvGraphicFramePr>
+              <a:graphicFrameLocks xmlns:a="http://schemas.openxmlformats.org/drawingml/2006/main" noChangeAspect="1"/>
+            </wp:cNvGraphicFramePr>
+            <a:graphic xmlns:a="http://schemas.openxmlformats.org/drawingml/2006/main">
+              <a:graphicData uri="http://schemas.openxmlformats.org/drawingml/2006/picture">
+                <pic:pic xmlns:pic="http://schemas.openxmlformats.org/drawingml/2006/picture">
+                  <pic:nvPicPr>
+                    <pic:cNvPr id="644525556" name=""/>
+                    <pic:cNvPicPr/>
+                  </pic:nvPicPr>
+                  <pic:blipFill>
+                    <a:blip r:embed="rId38"/>
+                    <a:stretch>
+                      <a:fillRect/>
+                    </a:stretch>
+                  </pic:blipFill>
+                  <pic:spPr>
+                    <a:xfrm>
+                      <a:off x="0" y="0"/>
+                      <a:ext cx="5943600" cy="3363595"/>
+                    </a:xfrm>
+                    <a:prstGeom prst="rect">
+                      <a:avLst/>
+                    </a:prstGeom>
+                  </pic:spPr>
+                </pic:pic>
+              </a:graphicData>
+            </a:graphic>
+          </wp:inline>
+        </w:drawing>
+      </w:r>
+    </w:p>
+    <w:p>
+      <w:pPr>
+        <w:rPr>
+          <w:b/>
+          <w:bCs/>
+          <w:sz w:val="32"/>
+          <w:szCs w:val="32"/>
+        </w:rPr>
+      </w:pPr>
+      <w:r>
+        <w:rPr>
+          <w:b/>
+          <w:bCs/>
+          <w:sz w:val="32"/>
+          <w:szCs w:val="32"/>
+        </w:rPr>
+        <w:t>Index backup validation:</w:t>
+      </w:r>
+    </w:p>
+    <w:p>
+      <w:pPr>
+        <w:rPr>
+          <w:b/>
+          <w:bCs/>
+          <w:sz w:val="32"/>
+          <w:szCs w:val="32"/>
+        </w:rPr>
+      </w:pPr>
+      <w:r>
+        <w:rPr>
+          <w:b/>
+          <w:bCs/>
+          <w:sz w:val="32"/>
+          <w:szCs w:val="32"/>
+        </w:rPr>
+        <w:lastRenderedPageBreak/>
+        <w:drawing>
+          <wp:inline distT="0" distB="0" distL="0" distR="0" wp14:anchorId="5D4CD747" wp14:editId="1CFFE8EB">
+            <wp:extent cx="5943600" cy="1551940"/>
+            <wp:effectExtent l="0" t="0" r="0" b="0"/>
+            <wp:docPr id="828825746" name="Picture 1"/>
+            <wp:cNvGraphicFramePr>
+              <a:graphicFrameLocks xmlns:a="http://schemas.openxmlformats.org/drawingml/2006/main" noChangeAspect="1"/>
+            </wp:cNvGraphicFramePr>
+            <a:graphic xmlns:a="http://schemas.openxmlformats.org/drawingml/2006/main">
+              <a:graphicData uri="http://schemas.openxmlformats.org/drawingml/2006/picture">
+                <pic:pic xmlns:pic="http://schemas.openxmlformats.org/drawingml/2006/picture">
+                  <pic:nvPicPr>
+                    <pic:cNvPr id="828825746" name=""/>
+                    <pic:cNvPicPr/>
+                  </pic:nvPicPr>
+                  <pic:blipFill>
+                    <a:blip r:embed="rId39"/>
+                    <a:stretch>
+                      <a:fillRect/>
+                    </a:stretch>
+                  </pic:blipFill>
+                  <pic:spPr>
+                    <a:xfrm>
+                      <a:off x="0" y="0"/>
+                      <a:ext cx="5943600" cy="1551940"/>
+                    </a:xfrm>
+                    <a:prstGeom prst="rect">
+                      <a:avLst/>
+                    </a:prstGeom>
+                  </pic:spPr>
+                </pic:pic>
+              </a:graphicData>
+            </a:graphic>
+          </wp:inline>
+        </w:drawing>
+      </w:r>
+    </w:p>
+    <w:p>
+      <w:pPr>
+        <w:rPr>
+          <w:b/>
+          <w:bCs/>
+          <w:sz w:val="32"/>
+          <w:szCs w:val="32"/>
+        </w:rPr>
+      </w:pPr>
     </w:p>
     <w:p>
       <w:pPr>
@@ -3215,7 +3729,6 @@
   <w:style w:type="character" w:default="1" w:styleId="DefaultParagraphFont">
     <w:name w:val="Default Paragraph Font"/>
     <w:uiPriority w:val="1"/>
-    <w:semiHidden/>
     <w:unhideWhenUsed/>
   </w:style>
   <w:style w:type="table" w:default="1" w:styleId="TableNormal">
@@ -3527,6 +4040,29 @@
       <w:smallCaps/>
       <w:color w:val="0F4761" w:themeColor="accent1" w:themeShade="BF"/>
       <w:spacing w:val="5"/>
+    </w:rPr>
+  </w:style>
+  <w:style w:type="character" w:styleId="Hyperlink">
+    <w:name w:val="Hyperlink"/>
+    <w:basedOn w:val="DefaultParagraphFont"/>
+    <w:uiPriority w:val="99"/>
+    <w:unhideWhenUsed/>
+    <w:rsid w:val="00B457D9"/>
+    <w:rPr>
+      <w:color w:val="467886" w:themeColor="hyperlink"/>
+      <w:u w:val="single"/>
+    </w:rPr>
+  </w:style>
+  <w:style w:type="character" w:styleId="UnresolvedMention">
+    <w:name w:val="Unresolved Mention"/>
+    <w:basedOn w:val="DefaultParagraphFont"/>
+    <w:uiPriority w:val="99"/>
+    <w:semiHidden/>
+    <w:unhideWhenUsed/>
+    <w:rsid w:val="00B457D9"/>
+    <w:rPr>
+      <w:color w:val="605E5C"/>
+      <w:shd w:val="clear" w:color="auto" w:fill="E1DFDD"/>
     </w:rPr>
   </w:style>
 </w:styles>

</xml_diff>